<commit_message>
detailed game plan is uploaded
</commit_message>
<xml_diff>
--- a/docs/game_design_document.docx
+++ b/docs/game_design_document.docx
@@ -1,28 +1,72 @@
 
 <file path=word/document.xml><?xml version="1.0" encoding="utf-8"?>
 <w:document xmlns:wpc="http://schemas.microsoft.com/office/word/2010/wordprocessingCanvas" xmlns:cx="http://schemas.microsoft.com/office/drawing/2014/chartex" xmlns:cx1="http://schemas.microsoft.com/office/drawing/2015/9/8/chartex" xmlns:cx2="http://schemas.microsoft.com/office/drawing/2015/10/21/chartex" xmlns:cx3="http://schemas.microsoft.com/office/drawing/2016/5/9/chartex" xmlns:cx4="http://schemas.microsoft.com/office/drawing/2016/5/10/chartex" xmlns:cx5="http://schemas.microsoft.com/office/drawing/2016/5/11/chartex" xmlns:cx6="http://schemas.microsoft.com/office/drawing/2016/5/12/chartex" xmlns:cx7="http://schemas.microsoft.com/office/drawing/2016/5/13/chartex" xmlns:cx8="http://schemas.microsoft.com/office/drawing/2016/5/14/chartex" xmlns:mc="http://schemas.openxmlformats.org/markup-compatibility/2006" xmlns:aink="http://schemas.microsoft.com/office/drawing/2016/ink" xmlns:am3d="http://schemas.microsoft.com/office/drawing/2017/model3d" xmlns:o="urn:schemas-microsoft-com:office:office" xmlns:oel="http://schemas.microsoft.com/office/2019/extlst" xmlns:r="http://schemas.openxmlformats.org/officeDocument/2006/relationships" xmlns:m="http://schemas.openxmlformats.org/officeDocument/2006/math" xmlns:v="urn:schemas-microsoft-com:vml" xmlns:wp14="http://schemas.microsoft.com/office/word/2010/wordprocessingDrawing" xmlns:wp="http://schemas.openxmlformats.org/drawingml/2006/wordprocessingDrawing" xmlns:w10="urn:schemas-microsoft-com:office:word" xmlns:w="http://schemas.openxmlformats.org/wordprocessingml/2006/main" xmlns:w14="http://schemas.microsoft.com/office/word/2010/wordml" xmlns:w15="http://schemas.microsoft.com/office/word/2012/wordml" xmlns:w16cex="http://schemas.microsoft.com/office/word/2018/wordml/cex" xmlns:w16cid="http://schemas.microsoft.com/office/word/2016/wordml/cid" xmlns:w16="http://schemas.microsoft.com/office/word/2018/wordml" xmlns:w16du="http://schemas.microsoft.com/office/word/2023/wordml/word16du" xmlns:w16sdtdh="http://schemas.microsoft.com/office/word/2020/wordml/sdtdatahash" xmlns:w16sdtfl="http://schemas.microsoft.com/office/word/2024/wordml/sdtformatlock" xmlns:w16se="http://schemas.microsoft.com/office/word/2015/wordml/symex" xmlns:wpg="http://schemas.microsoft.com/office/word/2010/wordprocessingGroup" xmlns:wpi="http://schemas.microsoft.com/office/word/2010/wordprocessingInk" xmlns:wne="http://schemas.microsoft.com/office/word/2006/wordml" xmlns:wps="http://schemas.microsoft.com/office/word/2010/wordprocessingShape" mc:Ignorable="w14 w15 w16se w16cid w16 w16cex w16sdtdh w16sdtfl w16du wp14">
+  <w:background w:color="000000" w:themeColor="text1"/>
   <w:body>
     <w:p>
       <w:pPr>
+        <w:spacing w:after="0"/>
         <w:jc w:val="center"/>
         <w:rPr>
-          <w:sz w:val="36"/>
-          <w:szCs w:val="36"/>
-        </w:rPr>
-      </w:pPr>
-      <w:r>
-        <w:rPr>
-          <w:sz w:val="36"/>
-          <w:szCs w:val="36"/>
+          <w:rFonts w:ascii="Algerian" w:hAnsi="Algerian"/>
+          <w:color w:val="00FFFF"/>
+          <w:sz w:val="52"/>
+          <w:szCs w:val="52"/>
+        </w:rPr>
+      </w:pPr>
+      <w:r>
+        <w:rPr>
+          <w:rFonts w:ascii="Algerian" w:hAnsi="Algerian"/>
+          <w:color w:val="00FFFF"/>
+          <w:sz w:val="52"/>
+          <w:szCs w:val="52"/>
         </w:rPr>
         <w:t>Borsod Rally</w:t>
       </w:r>
     </w:p>
     <w:p>
-      <w:r>
-        <w:rPr>
+      <w:pPr>
+        <w:spacing w:after="360"/>
+        <w:jc w:val="center"/>
+        <w:rPr>
+          <w:rFonts w:ascii="Verdana" w:hAnsi="Verdana"/>
+          <w:color w:val="FFFFFF" w:themeColor="background1"/>
+        </w:rPr>
+      </w:pPr>
+      <w:r>
+        <w:rPr>
+          <w:rFonts w:ascii="Verdana" w:hAnsi="Verdana"/>
+          <w:color w:val="FFFFFF" w:themeColor="background1"/>
+        </w:rPr>
+        <w:t>Részletes j</w:t>
+      </w:r>
+      <w:r>
+        <w:rPr>
+          <w:rFonts w:ascii="Verdana" w:hAnsi="Verdana"/>
+          <w:color w:val="FFFFFF" w:themeColor="background1"/>
+        </w:rPr>
+        <w:t>átéktervezet</w:t>
+      </w:r>
+    </w:p>
+    <w:p>
+      <w:pPr>
+        <w:rPr>
+          <w:rFonts w:ascii="Verdana" w:hAnsi="Verdana"/>
+          <w:b/>
+          <w:bCs/>
+          <w:color w:val="FFD100"/>
           <w:sz w:val="28"/>
           <w:szCs w:val="28"/>
+        </w:rPr>
+      </w:pPr>
+      <w:r>
+        <w:rPr>
+          <w:rFonts w:ascii="Verdana" w:hAnsi="Verdana"/>
+          <w:b/>
+          <w:bCs/>
+          <w:color w:val="FFD100"/>
+          <w:sz w:val="32"/>
+          <w:szCs w:val="32"/>
         </w:rPr>
         <w:t>Fejlesztők</w:t>
       </w:r>
@@ -34,8 +78,16 @@
           <w:ilvl w:val="0"/>
           <w:numId w:val="1"/>
         </w:numPr>
-      </w:pPr>
-      <w:r>
+        <w:rPr>
+          <w:rFonts w:ascii="Verdana" w:hAnsi="Verdana"/>
+          <w:color w:val="FFFFFF" w:themeColor="background1"/>
+        </w:rPr>
+      </w:pPr>
+      <w:r>
+        <w:rPr>
+          <w:rFonts w:ascii="Verdana" w:hAnsi="Verdana"/>
+          <w:color w:val="FFFFFF" w:themeColor="background1"/>
+        </w:rPr>
         <w:t>Kovács Nimród Ányos</w:t>
       </w:r>
     </w:p>
@@ -46,28 +98,67 @@
           <w:ilvl w:val="0"/>
           <w:numId w:val="1"/>
         </w:numPr>
-      </w:pPr>
-      <w:r>
+        <w:rPr>
+          <w:rFonts w:ascii="Verdana" w:hAnsi="Verdana"/>
+          <w:color w:val="FFFFFF" w:themeColor="background1"/>
+        </w:rPr>
+      </w:pPr>
+      <w:r>
+        <w:rPr>
+          <w:rFonts w:ascii="Verdana" w:hAnsi="Verdana"/>
+          <w:color w:val="FFFFFF" w:themeColor="background1"/>
+        </w:rPr>
         <w:t>Szobek Ádám Márk</w:t>
       </w:r>
     </w:p>
     <w:p>
       <w:pPr>
-        <w:rPr>
-          <w:sz w:val="28"/>
-          <w:szCs w:val="28"/>
-        </w:rPr>
-      </w:pPr>
-      <w:r>
-        <w:rPr>
-          <w:sz w:val="28"/>
-          <w:szCs w:val="28"/>
-        </w:rPr>
-        <w:t>Menü</w:t>
-      </w:r>
-    </w:p>
-    <w:p>
-      <w:r>
+        <w:spacing w:before="360" w:after="240"/>
+        <w:rPr>
+          <w:rFonts w:ascii="Verdana" w:hAnsi="Verdana"/>
+          <w:b/>
+          <w:bCs/>
+          <w:color w:val="FFD100"/>
+          <w:sz w:val="32"/>
+          <w:szCs w:val="32"/>
+        </w:rPr>
+      </w:pPr>
+      <w:r>
+        <w:rPr>
+          <w:rFonts w:ascii="Verdana" w:hAnsi="Verdana"/>
+          <w:b/>
+          <w:bCs/>
+          <w:color w:val="FFD100"/>
+          <w:sz w:val="32"/>
+          <w:szCs w:val="32"/>
+        </w:rPr>
+        <w:t>Főm</w:t>
+      </w:r>
+      <w:r>
+        <w:rPr>
+          <w:rFonts w:ascii="Verdana" w:hAnsi="Verdana"/>
+          <w:b/>
+          <w:bCs/>
+          <w:color w:val="FFD100"/>
+          <w:sz w:val="32"/>
+          <w:szCs w:val="32"/>
+        </w:rPr>
+        <w:t>enü</w:t>
+      </w:r>
+    </w:p>
+    <w:p>
+      <w:pPr>
+        <w:jc w:val="both"/>
+        <w:rPr>
+          <w:rFonts w:ascii="Verdana" w:hAnsi="Verdana"/>
+          <w:color w:val="FFFFFF" w:themeColor="background1"/>
+        </w:rPr>
+      </w:pPr>
+      <w:r>
+        <w:rPr>
+          <w:rFonts w:ascii="Verdana" w:hAnsi="Verdana"/>
+          <w:color w:val="FFFFFF" w:themeColor="background1"/>
+        </w:rPr>
         <w:t>A játék beindulását követően a játékos a főmenüben találja magát. A játék fő funkciói erről a képernyőről érhetőek el, melyek:</w:t>
       </w:r>
     </w:p>
@@ -78,8 +169,17 @@
           <w:ilvl w:val="0"/>
           <w:numId w:val="2"/>
         </w:numPr>
-      </w:pPr>
-      <w:r>
+        <w:jc w:val="both"/>
+        <w:rPr>
+          <w:rFonts w:ascii="Verdana" w:hAnsi="Verdana"/>
+          <w:color w:val="FFFFFF" w:themeColor="background1"/>
+        </w:rPr>
+      </w:pPr>
+      <w:r>
+        <w:rPr>
+          <w:rFonts w:ascii="Verdana" w:hAnsi="Verdana"/>
+          <w:color w:val="FFFFFF" w:themeColor="background1"/>
+        </w:rPr>
         <w:t>Játék indítása</w:t>
       </w:r>
     </w:p>
@@ -90,8 +190,17 @@
           <w:ilvl w:val="0"/>
           <w:numId w:val="2"/>
         </w:numPr>
-      </w:pPr>
-      <w:r>
+        <w:jc w:val="both"/>
+        <w:rPr>
+          <w:rFonts w:ascii="Verdana" w:hAnsi="Verdana"/>
+          <w:color w:val="FFFFFF" w:themeColor="background1"/>
+        </w:rPr>
+      </w:pPr>
+      <w:r>
+        <w:rPr>
+          <w:rFonts w:ascii="Verdana" w:hAnsi="Verdana"/>
+          <w:color w:val="FFFFFF" w:themeColor="background1"/>
+        </w:rPr>
         <w:t>Beállítások</w:t>
       </w:r>
     </w:p>
@@ -102,125 +211,472 @@
           <w:ilvl w:val="0"/>
           <w:numId w:val="2"/>
         </w:numPr>
-      </w:pPr>
-      <w:r>
+        <w:jc w:val="both"/>
+        <w:rPr>
+          <w:rFonts w:ascii="Verdana" w:hAnsi="Verdana"/>
+          <w:color w:val="FFFFFF" w:themeColor="background1"/>
+        </w:rPr>
+      </w:pPr>
+      <w:r>
+        <w:rPr>
+          <w:rFonts w:ascii="Verdana" w:hAnsi="Verdana"/>
+          <w:color w:val="FFFFFF" w:themeColor="background1"/>
+        </w:rPr>
         <w:t>Kilépés</w:t>
       </w:r>
     </w:p>
     <w:p>
-      <w:r>
-        <w:t xml:space="preserve">A játék indítása gombra kattintva a játékos két további almenüvel találja szembe magát, egyedül (singleplayer) vagy többedmagával (multiplayer) kívánja e eltölteni szabadidejét. Az előbbi </w:t>
-      </w:r>
-      <w:r>
-        <w:t xml:space="preserve">(singleplayer) </w:t>
-      </w:r>
-      <w:r>
+      <w:pPr>
+        <w:jc w:val="both"/>
+        <w:rPr>
+          <w:rFonts w:ascii="Verdana" w:hAnsi="Verdana"/>
+          <w:color w:val="FFFFFF" w:themeColor="background1"/>
+        </w:rPr>
+      </w:pPr>
+      <w:r>
+        <w:rPr>
+          <w:rFonts w:ascii="Verdana" w:hAnsi="Verdana"/>
+          <w:color w:val="FFFFFF" w:themeColor="background1"/>
+        </w:rPr>
+        <w:t xml:space="preserve">A </w:t>
+      </w:r>
+      <w:r>
+        <w:rPr>
+          <w:rFonts w:ascii="Verdana" w:hAnsi="Verdana"/>
+          <w:b/>
+          <w:bCs/>
+          <w:color w:val="FFFFFF" w:themeColor="background1"/>
+        </w:rPr>
+        <w:t>játék indítása</w:t>
+      </w:r>
+      <w:r>
+        <w:rPr>
+          <w:rFonts w:ascii="Verdana" w:hAnsi="Verdana"/>
+          <w:color w:val="FFFFFF" w:themeColor="background1"/>
+        </w:rPr>
+        <w:t xml:space="preserve"> gombra kattintva a játékos két további almenüvel találja szembe magát,</w:t>
+      </w:r>
+      <w:r>
+        <w:rPr>
+          <w:rFonts w:ascii="Verdana" w:hAnsi="Verdana"/>
+          <w:color w:val="FFFFFF" w:themeColor="background1"/>
+        </w:rPr>
+        <w:t xml:space="preserve"> ezekkel kiválaszthatja, hogy</w:t>
+      </w:r>
+      <w:r>
+        <w:rPr>
+          <w:rFonts w:ascii="Verdana" w:hAnsi="Verdana"/>
+          <w:color w:val="FFFFFF" w:themeColor="background1"/>
+        </w:rPr>
+        <w:t xml:space="preserve"> egyedül (</w:t>
+      </w:r>
+      <w:r>
+        <w:rPr>
+          <w:rFonts w:ascii="Verdana" w:hAnsi="Verdana"/>
+          <w:i/>
+          <w:iCs/>
+          <w:color w:val="FFFFFF" w:themeColor="background1"/>
+        </w:rPr>
+        <w:t>singleplayer</w:t>
+      </w:r>
+      <w:r>
+        <w:rPr>
+          <w:rFonts w:ascii="Verdana" w:hAnsi="Verdana"/>
+          <w:color w:val="FFFFFF" w:themeColor="background1"/>
+        </w:rPr>
+        <w:t>) vagy többedmagával (</w:t>
+      </w:r>
+      <w:r>
+        <w:rPr>
+          <w:rFonts w:ascii="Verdana" w:hAnsi="Verdana"/>
+          <w:i/>
+          <w:iCs/>
+          <w:color w:val="FFFFFF" w:themeColor="background1"/>
+        </w:rPr>
+        <w:t>multiplayer</w:t>
+      </w:r>
+      <w:r>
+        <w:rPr>
+          <w:rFonts w:ascii="Verdana" w:hAnsi="Verdana"/>
+          <w:color w:val="FFFFFF" w:themeColor="background1"/>
+        </w:rPr>
+        <w:t xml:space="preserve">) kívánja e eltölteni szabadidejét. Az előbbi </w:t>
+      </w:r>
+      <w:r>
+        <w:rPr>
+          <w:rFonts w:ascii="Verdana" w:hAnsi="Verdana"/>
+          <w:color w:val="FFFFFF" w:themeColor="background1"/>
+        </w:rPr>
+        <w:t>(</w:t>
+      </w:r>
+      <w:r>
+        <w:rPr>
+          <w:rFonts w:ascii="Verdana" w:hAnsi="Verdana"/>
+          <w:i/>
+          <w:iCs/>
+          <w:color w:val="FFFFFF" w:themeColor="background1"/>
+        </w:rPr>
+        <w:t>singleplayer</w:t>
+      </w:r>
+      <w:r>
+        <w:rPr>
+          <w:rFonts w:ascii="Verdana" w:hAnsi="Verdana"/>
+          <w:color w:val="FFFFFF" w:themeColor="background1"/>
+        </w:rPr>
+        <w:t xml:space="preserve">) </w:t>
+      </w:r>
+      <w:r>
+        <w:rPr>
+          <w:rFonts w:ascii="Verdana" w:hAnsi="Verdana"/>
+          <w:color w:val="FFFFFF" w:themeColor="background1"/>
+        </w:rPr>
         <w:t>esetben lehetősége van beállítani a pálya paramétereit a játék tényleges elindítása előtt.</w:t>
       </w:r>
       <w:r>
+        <w:rPr>
+          <w:rFonts w:ascii="Verdana" w:hAnsi="Verdana"/>
+          <w:color w:val="FFFFFF" w:themeColor="background1"/>
+        </w:rPr>
         <w:t xml:space="preserve"> </w:t>
       </w:r>
       <w:r>
-        <w:t>Az utóbbi (multiplayer)</w:t>
-      </w:r>
-      <w:r>
+        <w:rPr>
+          <w:rFonts w:ascii="Verdana" w:hAnsi="Verdana"/>
+          <w:color w:val="FFFFFF" w:themeColor="background1"/>
+        </w:rPr>
+        <w:t>Az utóbbi (</w:t>
+      </w:r>
+      <w:r>
+        <w:rPr>
+          <w:rFonts w:ascii="Verdana" w:hAnsi="Verdana"/>
+          <w:i/>
+          <w:iCs/>
+          <w:color w:val="FFFFFF" w:themeColor="background1"/>
+        </w:rPr>
+        <w:t>multiplayer</w:t>
+      </w:r>
+      <w:r>
+        <w:rPr>
+          <w:rFonts w:ascii="Verdana" w:hAnsi="Verdana"/>
+          <w:color w:val="FFFFFF" w:themeColor="background1"/>
+        </w:rPr>
+        <w:t>)</w:t>
+      </w:r>
+      <w:r>
+        <w:rPr>
+          <w:rFonts w:ascii="Verdana" w:hAnsi="Verdana"/>
+          <w:color w:val="FFFFFF" w:themeColor="background1"/>
+        </w:rPr>
         <w:t xml:space="preserve"> esetben a játékosnak lehetősége van egy új </w:t>
       </w:r>
       <w:r>
+        <w:rPr>
+          <w:rFonts w:ascii="Verdana" w:hAnsi="Verdana"/>
+          <w:color w:val="FFFFFF" w:themeColor="background1"/>
+        </w:rPr>
         <w:t>szobá</w:t>
       </w:r>
       <w:r>
+        <w:rPr>
+          <w:rFonts w:ascii="Verdana" w:hAnsi="Verdana"/>
+          <w:color w:val="FFFFFF" w:themeColor="background1"/>
+        </w:rPr>
         <w:t xml:space="preserve">t indítani (ekkor a pálya paraméterei szintén megadhatóak) vagy egy meglévőhöz csatlakozni (ebben az esetben a játék automatikusan felderíti a helyi hálózatot nyitott </w:t>
       </w:r>
       <w:r>
+        <w:rPr>
+          <w:rFonts w:ascii="Verdana" w:hAnsi="Verdana"/>
+          <w:color w:val="FFFFFF" w:themeColor="background1"/>
+        </w:rPr>
         <w:t>szobá</w:t>
       </w:r>
       <w:r>
+        <w:rPr>
+          <w:rFonts w:ascii="Verdana" w:hAnsi="Verdana"/>
+          <w:color w:val="FFFFFF" w:themeColor="background1"/>
+        </w:rPr>
         <w:t>k után).</w:t>
       </w:r>
     </w:p>
     <w:p>
-      <w:r>
-        <w:t>A beállítások almenüben a játék</w:t>
-      </w:r>
-      <w:r>
+      <w:pPr>
+        <w:jc w:val="both"/>
+        <w:rPr>
+          <w:rFonts w:ascii="Verdana" w:hAnsi="Verdana"/>
+          <w:color w:val="FFFFFF" w:themeColor="background1"/>
+        </w:rPr>
+      </w:pPr>
+      <w:r>
+        <w:rPr>
+          <w:rFonts w:ascii="Verdana" w:hAnsi="Verdana"/>
+          <w:color w:val="FFFFFF" w:themeColor="background1"/>
+        </w:rPr>
+        <w:t xml:space="preserve">A </w:t>
+      </w:r>
+      <w:r>
+        <w:rPr>
+          <w:rFonts w:ascii="Verdana" w:hAnsi="Verdana"/>
+          <w:b/>
+          <w:bCs/>
+          <w:color w:val="FFFFFF" w:themeColor="background1"/>
+        </w:rPr>
+        <w:t>beállítások</w:t>
+      </w:r>
+      <w:r>
+        <w:rPr>
+          <w:rFonts w:ascii="Verdana" w:hAnsi="Verdana"/>
+          <w:color w:val="FFFFFF" w:themeColor="background1"/>
+        </w:rPr>
+        <w:t xml:space="preserve"> almenüben a játék</w:t>
+      </w:r>
+      <w:r>
+        <w:rPr>
+          <w:rFonts w:ascii="Verdana" w:hAnsi="Verdana"/>
+          <w:color w:val="FFFFFF" w:themeColor="background1"/>
+        </w:rPr>
         <w:t xml:space="preserve"> tulajdonságai állíthatóak be, ilyen például a hangerő és a bemeneti érzékenység.</w:t>
       </w:r>
     </w:p>
     <w:p>
-      <w:r>
-        <w:t>A kilépés gomb (hűen a nevéhez) kilép az alkalmazásból.</w:t>
-      </w:r>
-    </w:p>
-    <w:p>
-      <w:pPr>
-        <w:rPr>
+      <w:pPr>
+        <w:jc w:val="both"/>
+        <w:rPr>
+          <w:rFonts w:ascii="Verdana" w:hAnsi="Verdana"/>
+          <w:color w:val="FFFFFF" w:themeColor="background1"/>
+        </w:rPr>
+      </w:pPr>
+      <w:r>
+        <w:rPr>
+          <w:rFonts w:ascii="Verdana" w:hAnsi="Verdana"/>
+          <w:color w:val="FFFFFF" w:themeColor="background1"/>
+        </w:rPr>
+        <w:t xml:space="preserve">A </w:t>
+      </w:r>
+      <w:r>
+        <w:rPr>
+          <w:rFonts w:ascii="Verdana" w:hAnsi="Verdana"/>
+          <w:b/>
+          <w:bCs/>
+          <w:color w:val="FFFFFF" w:themeColor="background1"/>
+        </w:rPr>
+        <w:t>kilépés</w:t>
+      </w:r>
+      <w:r>
+        <w:rPr>
+          <w:rFonts w:ascii="Verdana" w:hAnsi="Verdana"/>
+          <w:color w:val="FFFFFF" w:themeColor="background1"/>
+        </w:rPr>
+        <w:t xml:space="preserve"> gomb (hűen a nevéhez) kilép az alkalmazásból.</w:t>
+      </w:r>
+    </w:p>
+    <w:p>
+      <w:pPr>
+        <w:spacing w:before="360" w:after="240"/>
+        <w:rPr>
+          <w:rFonts w:ascii="Verdana" w:hAnsi="Verdana"/>
+          <w:b/>
+          <w:bCs/>
+          <w:color w:val="FFD100"/>
+          <w:sz w:val="32"/>
+          <w:szCs w:val="32"/>
+        </w:rPr>
+      </w:pPr>
+      <w:r>
+        <w:rPr>
+          <w:rFonts w:ascii="Verdana" w:hAnsi="Verdana"/>
+          <w:b/>
+          <w:bCs/>
+          <w:color w:val="FFD100"/>
+          <w:sz w:val="32"/>
+          <w:szCs w:val="32"/>
+        </w:rPr>
+        <w:t>Core gameplay</w:t>
+      </w:r>
+    </w:p>
+    <w:p>
+      <w:pPr>
+        <w:jc w:val="both"/>
+        <w:rPr>
+          <w:rFonts w:ascii="Verdana" w:hAnsi="Verdana"/>
+          <w:color w:val="FFFFFF" w:themeColor="background1"/>
+        </w:rPr>
+      </w:pPr>
+      <w:r>
+        <w:rPr>
+          <w:rFonts w:ascii="Verdana" w:hAnsi="Verdana"/>
+          <w:color w:val="FFFFFF" w:themeColor="background1"/>
+        </w:rPr>
+        <w:t>A játék egy árkád versenyzős játék, ahol a játékos arra törekszik, hogy elsőként érje el a célvonalat</w:t>
+      </w:r>
+      <w:r>
+        <w:rPr>
+          <w:rFonts w:ascii="Verdana" w:hAnsi="Verdana"/>
+          <w:color w:val="FFFFFF" w:themeColor="background1"/>
+        </w:rPr>
+        <w:t>.</w:t>
+      </w:r>
+    </w:p>
+    <w:p>
+      <w:pPr>
+        <w:jc w:val="both"/>
+        <w:rPr>
+          <w:rFonts w:ascii="Verdana" w:hAnsi="Verdana"/>
+          <w:color w:val="FFFFFF" w:themeColor="background1"/>
+        </w:rPr>
+      </w:pPr>
+      <w:r>
+        <w:rPr>
+          <w:rFonts w:ascii="Verdana" w:hAnsi="Verdana"/>
+          <w:color w:val="FFFFFF" w:themeColor="background1"/>
+        </w:rPr>
+        <w:t>A verseny kezdetekor a játékos</w:t>
+      </w:r>
+      <w:r>
+        <w:rPr>
+          <w:rFonts w:ascii="Verdana" w:hAnsi="Verdana"/>
+          <w:color w:val="FFFFFF" w:themeColor="background1"/>
+        </w:rPr>
+        <w:t xml:space="preserve"> (többjátékos esetében a szoba </w:t>
+      </w:r>
+      <w:r>
+        <w:rPr>
+          <w:rFonts w:ascii="Verdana" w:hAnsi="Verdana"/>
+          <w:i/>
+          <w:iCs/>
+          <w:color w:val="FFFFFF" w:themeColor="background1"/>
+        </w:rPr>
+        <w:t>host</w:t>
+      </w:r>
+      <w:r>
+        <w:rPr>
+          <w:rFonts w:ascii="Verdana" w:hAnsi="Verdana"/>
+          <w:color w:val="FFFFFF" w:themeColor="background1"/>
+        </w:rPr>
+        <w:t>ja)</w:t>
+      </w:r>
+      <w:r>
+        <w:rPr>
+          <w:rFonts w:ascii="Verdana" w:hAnsi="Verdana"/>
+          <w:color w:val="FFFFFF" w:themeColor="background1"/>
+        </w:rPr>
+        <w:t xml:space="preserve"> által megadott paraméterek alapján legenerálódik a versenypálya. Ezután elkezdődik egy visszaszámlálás, amely lejártával a versenyzők elindulhatnak.</w:t>
+      </w:r>
+    </w:p>
+    <w:p>
+      <w:pPr>
+        <w:jc w:val="both"/>
+        <w:rPr>
+          <w:rFonts w:ascii="Verdana" w:hAnsi="Verdana"/>
+          <w:color w:val="FFFFFF" w:themeColor="background1"/>
+        </w:rPr>
+      </w:pPr>
+      <w:r>
+        <w:rPr>
+          <w:rFonts w:ascii="Verdana" w:hAnsi="Verdana"/>
+          <w:color w:val="FFFFFF" w:themeColor="background1"/>
+        </w:rPr>
+        <w:t>A verseny közben a játékos az autót a billentyűzet segítségével irányíthatja.</w:t>
+      </w:r>
+    </w:p>
+    <w:p>
+      <w:pPr>
+        <w:rPr>
+          <w:rFonts w:ascii="Verdana" w:hAnsi="Verdana"/>
+          <w:color w:val="FFFFFF" w:themeColor="background1"/>
+        </w:rPr>
+      </w:pPr>
+      <w:r>
+        <w:rPr>
+          <w:rFonts w:ascii="Verdana" w:hAnsi="Verdana"/>
+          <w:color w:val="FFFFFF" w:themeColor="background1"/>
+        </w:rPr>
+        <w:lastRenderedPageBreak/>
+        <w:t>Az ellenfelek</w:t>
+      </w:r>
+      <w:r>
+        <w:rPr>
+          <w:rFonts w:ascii="Verdana" w:hAnsi="Verdana"/>
+          <w:color w:val="FFFFFF" w:themeColor="background1"/>
+        </w:rPr>
+        <w:t>et egyjátékos módban egy ML modell, többjátékos módban más, azonos hálózaton játszó játékosok irányítják.</w:t>
+      </w:r>
+    </w:p>
+    <w:p>
+      <w:pPr>
+        <w:jc w:val="both"/>
+        <w:rPr>
+          <w:rFonts w:ascii="Verdana" w:hAnsi="Verdana"/>
+          <w:color w:val="FFFFFF" w:themeColor="background1"/>
+        </w:rPr>
+      </w:pPr>
+      <w:r>
+        <w:rPr>
+          <w:rFonts w:ascii="Verdana" w:hAnsi="Verdana"/>
+          <w:color w:val="FFFFFF" w:themeColor="background1"/>
+        </w:rPr>
+        <w:t xml:space="preserve">A játékos </w:t>
+      </w:r>
+      <w:r>
+        <w:rPr>
+          <w:rFonts w:ascii="Verdana" w:hAnsi="Verdana"/>
+          <w:i/>
+          <w:iCs/>
+          <w:color w:val="FFFFFF" w:themeColor="background1"/>
+        </w:rPr>
+        <w:t>multiplayer</w:t>
+      </w:r>
+      <w:r>
+        <w:rPr>
+          <w:rFonts w:ascii="Verdana" w:hAnsi="Verdana"/>
+          <w:color w:val="FFFFFF" w:themeColor="background1"/>
+        </w:rPr>
+        <w:t xml:space="preserve"> esetében a célbaérést követően egy táblázatban tudja megtekinteni.</w:t>
+      </w:r>
+    </w:p>
+    <w:p>
+      <w:pPr>
+        <w:spacing w:before="360" w:after="240"/>
+        <w:rPr>
+          <w:rFonts w:ascii="Verdana" w:hAnsi="Verdana"/>
+          <w:b/>
+          <w:bCs/>
+          <w:color w:val="FFFFFF" w:themeColor="background1"/>
           <w:sz w:val="28"/>
           <w:szCs w:val="28"/>
         </w:rPr>
       </w:pPr>
       <w:r>
         <w:rPr>
-          <w:sz w:val="28"/>
-          <w:szCs w:val="28"/>
-        </w:rPr>
-        <w:t>Core gameplay</w:t>
-      </w:r>
-    </w:p>
-    <w:p>
-      <w:r>
-        <w:t>A játék egy árkád versenyzős játék, ahol a játékos arra törekszik, hogy elsőként érje el a célvonalat</w:t>
-      </w:r>
-      <w:r>
-        <w:t>.</w:t>
-      </w:r>
-    </w:p>
-    <w:p>
-      <w:r>
-        <w:t>A verseny kezdetekor a játékos</w:t>
-      </w:r>
-      <w:r>
-        <w:t xml:space="preserve"> </w:t>
-      </w:r>
-      <w:r>
-        <w:t>(többjátékos esetében a szoba hostja)</w:t>
-      </w:r>
-      <w:r>
-        <w:t xml:space="preserve"> által megadott paraméterek alapján legenerálódik a versenypálya. Ezután elkezdődik egy visszaszámlálás, amely lejártával a versenyzők elindulhatnak.</w:t>
-      </w:r>
-    </w:p>
-    <w:p>
-      <w:r>
-        <w:t xml:space="preserve">A verseny közben a játékos az autót a billentyűzet segítségével irányíthatja. </w:t>
-      </w:r>
-    </w:p>
-    <w:p>
-      <w:r>
-        <w:t>Az ellenfelek</w:t>
-      </w:r>
-      <w:r>
-        <w:t>et egyjátékos módban egy ML modell, többjátékos módban más, azonos hálózaton játszó játékosok irányítják.</w:t>
-      </w:r>
-    </w:p>
-    <w:p>
-      <w:r>
-        <w:t>A játékos multiplayer esetében a célbaérést követően egy táblázatban tudja megtekinteni.</w:t>
-      </w:r>
-    </w:p>
-    <w:p>
-      <w:r>
-        <w:rPr>
-          <w:sz w:val="28"/>
-          <w:szCs w:val="28"/>
+          <w:rFonts w:ascii="Verdana" w:hAnsi="Verdana"/>
+          <w:b/>
+          <w:bCs/>
+          <w:color w:val="FFD100"/>
+          <w:sz w:val="32"/>
+          <w:szCs w:val="32"/>
         </w:rPr>
         <w:t>Pályagenerálás</w:t>
       </w:r>
     </w:p>
     <w:p>
-      <w:r>
+      <w:pPr>
+        <w:jc w:val="both"/>
+        <w:rPr>
+          <w:rFonts w:ascii="Verdana" w:hAnsi="Verdana"/>
+          <w:color w:val="FFFFFF" w:themeColor="background1"/>
+        </w:rPr>
+      </w:pPr>
+      <w:r>
+        <w:rPr>
+          <w:rFonts w:ascii="Verdana" w:hAnsi="Verdana"/>
+          <w:color w:val="FFFFFF" w:themeColor="background1"/>
+        </w:rPr>
         <w:t>A pálya generálásá</w:t>
       </w:r>
       <w:r>
+        <w:rPr>
+          <w:rFonts w:ascii="Verdana" w:hAnsi="Verdana"/>
+          <w:color w:val="FFFFFF" w:themeColor="background1"/>
+        </w:rPr>
         <w:t>sa a következő lépésekből áll:</w:t>
       </w:r>
     </w:p>
@@ -231,9 +687,17 @@
           <w:ilvl w:val="0"/>
           <w:numId w:val="3"/>
         </w:numPr>
-      </w:pPr>
-      <w:r>
-        <w:lastRenderedPageBreak/>
+        <w:jc w:val="both"/>
+        <w:rPr>
+          <w:rFonts w:ascii="Verdana" w:hAnsi="Verdana"/>
+          <w:color w:val="FFFFFF" w:themeColor="background1"/>
+        </w:rPr>
+      </w:pPr>
+      <w:r>
+        <w:rPr>
+          <w:rFonts w:ascii="Verdana" w:hAnsi="Verdana"/>
+          <w:color w:val="FFFFFF" w:themeColor="background1"/>
+        </w:rPr>
         <w:t>Kontrollpontok generálása</w:t>
       </w:r>
     </w:p>
@@ -244,17 +708,38 @@
           <w:ilvl w:val="0"/>
           <w:numId w:val="3"/>
         </w:numPr>
-      </w:pPr>
-      <w:r>
+        <w:jc w:val="both"/>
+        <w:rPr>
+          <w:rFonts w:ascii="Verdana" w:hAnsi="Verdana"/>
+          <w:color w:val="FFFFFF" w:themeColor="background1"/>
+        </w:rPr>
+      </w:pPr>
+      <w:r>
+        <w:rPr>
+          <w:rFonts w:ascii="Verdana" w:hAnsi="Verdana"/>
+          <w:color w:val="FFFFFF" w:themeColor="background1"/>
+        </w:rPr>
         <w:t xml:space="preserve">A </w:t>
       </w:r>
       <w:r>
+        <w:rPr>
+          <w:rFonts w:ascii="Verdana" w:hAnsi="Verdana"/>
+          <w:color w:val="FFFFFF" w:themeColor="background1"/>
+        </w:rPr>
         <w:t>p</w:t>
       </w:r>
       <w:r>
+        <w:rPr>
+          <w:rFonts w:ascii="Verdana" w:hAnsi="Verdana"/>
+          <w:color w:val="FFFFFF" w:themeColor="background1"/>
+        </w:rPr>
         <w:t>álya nyomvonalának illesztése</w:t>
       </w:r>
       <w:r>
+        <w:rPr>
+          <w:rFonts w:ascii="Verdana" w:hAnsi="Verdana"/>
+          <w:color w:val="FFFFFF" w:themeColor="background1"/>
+        </w:rPr>
         <w:t xml:space="preserve"> a generált pontokra</w:t>
       </w:r>
     </w:p>
@@ -265,26 +750,72 @@
           <w:ilvl w:val="0"/>
           <w:numId w:val="3"/>
         </w:numPr>
-      </w:pPr>
-      <w:r>
+        <w:jc w:val="both"/>
+        <w:rPr>
+          <w:rFonts w:ascii="Verdana" w:hAnsi="Verdana"/>
+          <w:color w:val="FFFFFF" w:themeColor="background1"/>
+        </w:rPr>
+      </w:pPr>
+      <w:r>
+        <w:rPr>
+          <w:rFonts w:ascii="Verdana" w:hAnsi="Verdana"/>
+          <w:color w:val="FFFFFF" w:themeColor="background1"/>
+        </w:rPr>
         <w:t xml:space="preserve">Ütköző- és vizuális háló </w:t>
       </w:r>
       <w:r>
+        <w:rPr>
+          <w:rFonts w:ascii="Verdana" w:hAnsi="Verdana"/>
+          <w:color w:val="FFFFFF" w:themeColor="background1"/>
+        </w:rPr>
         <w:t>felépítése a nyomvonalra</w:t>
       </w:r>
     </w:p>
     <w:p>
-      <w:r>
+      <w:pPr>
+        <w:jc w:val="both"/>
+        <w:rPr>
+          <w:rFonts w:ascii="Verdana" w:hAnsi="Verdana"/>
+          <w:color w:val="FFFFFF" w:themeColor="background1"/>
+        </w:rPr>
+      </w:pPr>
+      <w:r>
+        <w:rPr>
+          <w:rFonts w:ascii="Verdana" w:hAnsi="Verdana"/>
+          <w:color w:val="FFFFFF" w:themeColor="background1"/>
+        </w:rPr>
         <w:t>A pályagenerálás moduláris felépítése lehetőséget ad arra, hogy az első két lépés logikáját könnyen ki lehessen cserélni.</w:t>
       </w:r>
     </w:p>
     <w:p>
-      <w:r>
+      <w:pPr>
+        <w:jc w:val="both"/>
+        <w:rPr>
+          <w:rFonts w:ascii="Verdana" w:hAnsi="Verdana"/>
+          <w:color w:val="FFFFFF" w:themeColor="background1"/>
+        </w:rPr>
+      </w:pPr>
+      <w:r>
+        <w:rPr>
+          <w:rFonts w:ascii="Verdana" w:hAnsi="Verdana"/>
+          <w:color w:val="FFFFFF" w:themeColor="background1"/>
+        </w:rPr>
         <w:t>A harmadik lépésben a pálya több szegmensként lesz felépítve, mely hatékonyabbá teszi a pálya megjelenítését és az ütközések detektálását is.</w:t>
       </w:r>
     </w:p>
     <w:p>
-      <w:r>
+      <w:pPr>
+        <w:jc w:val="both"/>
+        <w:rPr>
+          <w:rFonts w:ascii="Verdana" w:hAnsi="Verdana"/>
+          <w:color w:val="FFFFFF" w:themeColor="background1"/>
+        </w:rPr>
+      </w:pPr>
+      <w:r>
+        <w:rPr>
+          <w:rFonts w:ascii="Verdana" w:hAnsi="Verdana"/>
+          <w:color w:val="FFFFFF" w:themeColor="background1"/>
+        </w:rPr>
         <w:t>A játékosnak lehetősége van a testre szabni a pályagenerálást, azaz beállítani a</w:t>
       </w:r>
     </w:p>
@@ -295,8 +826,17 @@
           <w:ilvl w:val="0"/>
           <w:numId w:val="4"/>
         </w:numPr>
-      </w:pPr>
-      <w:r>
+        <w:jc w:val="both"/>
+        <w:rPr>
+          <w:rFonts w:ascii="Verdana" w:hAnsi="Verdana"/>
+          <w:color w:val="FFFFFF" w:themeColor="background1"/>
+        </w:rPr>
+      </w:pPr>
+      <w:r>
+        <w:rPr>
+          <w:rFonts w:ascii="Verdana" w:hAnsi="Verdana"/>
+          <w:color w:val="FFFFFF" w:themeColor="background1"/>
+        </w:rPr>
         <w:t>hossz</w:t>
       </w:r>
     </w:p>
@@ -307,8 +847,17 @@
           <w:ilvl w:val="0"/>
           <w:numId w:val="4"/>
         </w:numPr>
-      </w:pPr>
-      <w:r>
+        <w:jc w:val="both"/>
+        <w:rPr>
+          <w:rFonts w:ascii="Verdana" w:hAnsi="Verdana"/>
+          <w:color w:val="FFFFFF" w:themeColor="background1"/>
+        </w:rPr>
+      </w:pPr>
+      <w:r>
+        <w:rPr>
+          <w:rFonts w:ascii="Verdana" w:hAnsi="Verdana"/>
+          <w:color w:val="FFFFFF" w:themeColor="background1"/>
+        </w:rPr>
         <w:t>kanyarok élessége</w:t>
       </w:r>
     </w:p>
@@ -319,27 +868,73 @@
           <w:ilvl w:val="0"/>
           <w:numId w:val="4"/>
         </w:numPr>
-      </w:pPr>
-      <w:r>
+        <w:jc w:val="both"/>
+        <w:rPr>
+          <w:rFonts w:ascii="Verdana" w:hAnsi="Verdana"/>
+          <w:color w:val="FFFFFF" w:themeColor="background1"/>
+        </w:rPr>
+      </w:pPr>
+      <w:r>
+        <w:rPr>
+          <w:rFonts w:ascii="Verdana" w:hAnsi="Verdana"/>
+          <w:color w:val="FFFFFF" w:themeColor="background1"/>
+        </w:rPr>
         <w:t>véletlen függvény kiindulási állapota (seed)</w:t>
       </w:r>
     </w:p>
     <w:p>
-      <w:r>
+      <w:pPr>
+        <w:jc w:val="both"/>
+        <w:rPr>
+          <w:rFonts w:ascii="Verdana" w:hAnsi="Verdana"/>
+          <w:color w:val="FFFFFF" w:themeColor="background1"/>
+        </w:rPr>
+      </w:pPr>
+      <w:r>
+        <w:rPr>
+          <w:rFonts w:ascii="Verdana" w:hAnsi="Verdana"/>
+          <w:color w:val="FFFFFF" w:themeColor="background1"/>
+        </w:rPr>
         <w:t>paramétereket.</w:t>
       </w:r>
     </w:p>
     <w:p>
-      <w:r>
-        <w:rPr>
+      <w:pPr>
+        <w:spacing w:before="360" w:after="240"/>
+        <w:rPr>
+          <w:rFonts w:ascii="Verdana" w:hAnsi="Verdana"/>
+          <w:b/>
+          <w:bCs/>
+          <w:color w:val="FFD100"/>
           <w:sz w:val="28"/>
           <w:szCs w:val="28"/>
         </w:rPr>
+      </w:pPr>
+      <w:r>
+        <w:rPr>
+          <w:rFonts w:ascii="Verdana" w:hAnsi="Verdana"/>
+          <w:b/>
+          <w:bCs/>
+          <w:color w:val="FFD100"/>
+          <w:sz w:val="32"/>
+          <w:szCs w:val="32"/>
+        </w:rPr>
         <w:t>Multiplayer</w:t>
       </w:r>
     </w:p>
     <w:p>
-      <w:r>
+      <w:pPr>
+        <w:jc w:val="both"/>
+        <w:rPr>
+          <w:rFonts w:ascii="Verdana" w:hAnsi="Verdana"/>
+          <w:color w:val="FFFFFF" w:themeColor="background1"/>
+        </w:rPr>
+      </w:pPr>
+      <w:r>
+        <w:rPr>
+          <w:rFonts w:ascii="Verdana" w:hAnsi="Verdana"/>
+          <w:color w:val="FFFFFF" w:themeColor="background1"/>
+        </w:rPr>
         <w:t>A többjátékos mód keretében több, egy helyi hálózaton levő játékos versenyezhet egymás ellen. A többjátékos játék indításának módja a következő:</w:t>
       </w:r>
     </w:p>
@@ -350,9 +945,34 @@
           <w:ilvl w:val="0"/>
           <w:numId w:val="5"/>
         </w:numPr>
-      </w:pPr>
-      <w:r>
-        <w:t>Egy játékos létrehoz egy szobát (host)</w:t>
+        <w:jc w:val="both"/>
+        <w:rPr>
+          <w:rFonts w:ascii="Verdana" w:hAnsi="Verdana"/>
+          <w:color w:val="FFFFFF" w:themeColor="background1"/>
+        </w:rPr>
+      </w:pPr>
+      <w:r>
+        <w:rPr>
+          <w:rFonts w:ascii="Verdana" w:hAnsi="Verdana"/>
+          <w:color w:val="FFFFFF" w:themeColor="background1"/>
+        </w:rPr>
+        <w:t>Egy játékos létrehoz egy szobát (</w:t>
+      </w:r>
+      <w:r>
+        <w:rPr>
+          <w:rFonts w:ascii="Verdana" w:hAnsi="Verdana"/>
+          <w:i/>
+          <w:iCs/>
+          <w:color w:val="FFFFFF" w:themeColor="background1"/>
+        </w:rPr>
+        <w:t>host</w:t>
+      </w:r>
+      <w:r>
+        <w:rPr>
+          <w:rFonts w:ascii="Verdana" w:hAnsi="Verdana"/>
+          <w:color w:val="FFFFFF" w:themeColor="background1"/>
+        </w:rPr>
+        <w:t>)</w:t>
       </w:r>
     </w:p>
     <w:p>
@@ -362,44 +982,152 @@
           <w:ilvl w:val="0"/>
           <w:numId w:val="5"/>
         </w:numPr>
-      </w:pPr>
-      <w:r>
-        <w:t>A többi játékos csatlakozik a szobához (join)</w:t>
-      </w:r>
-      <w:r>
+        <w:jc w:val="both"/>
+        <w:rPr>
+          <w:rFonts w:ascii="Verdana" w:hAnsi="Verdana"/>
+          <w:color w:val="FFFFFF" w:themeColor="background1"/>
+        </w:rPr>
+      </w:pPr>
+      <w:r>
+        <w:rPr>
+          <w:rFonts w:ascii="Verdana" w:hAnsi="Verdana"/>
+          <w:color w:val="FFFFFF" w:themeColor="background1"/>
+        </w:rPr>
+        <w:t>A többi játékos csatlakozik a szobához (</w:t>
+      </w:r>
+      <w:r>
+        <w:rPr>
+          <w:rFonts w:ascii="Verdana" w:hAnsi="Verdana"/>
+          <w:i/>
+          <w:iCs/>
+          <w:color w:val="FFFFFF" w:themeColor="background1"/>
+        </w:rPr>
+        <w:t>join</w:t>
+      </w:r>
+      <w:r>
+        <w:rPr>
+          <w:rFonts w:ascii="Verdana" w:hAnsi="Verdana"/>
+          <w:color w:val="FFFFFF" w:themeColor="background1"/>
+        </w:rPr>
+        <w:t>)</w:t>
+      </w:r>
+      <w:r>
+        <w:rPr>
+          <w:rFonts w:ascii="Verdana" w:hAnsi="Verdana"/>
+          <w:color w:val="FFFFFF" w:themeColor="background1"/>
+        </w:rPr>
         <w:t>. A nyitott szobák felderítése egy UDP broadcast üzenettel történik</w:t>
       </w:r>
     </w:p>
     <w:p>
-      <w:r>
-        <w:t>A létrehozás/csatlakozás után a játékos egy váróképernyővel találja szembe magát, amelyről a host tud továbblépni (ekkor az összes többi várakozó játékos is továbblép). Ezután elkezdődik a játék a „Core gameplay” szekcióban leírt módon</w:t>
-      </w:r>
-      <w:r>
+      <w:pPr>
+        <w:jc w:val="both"/>
+        <w:rPr>
+          <w:rFonts w:ascii="Verdana" w:hAnsi="Verdana"/>
+          <w:color w:val="FFFFFF" w:themeColor="background1"/>
+        </w:rPr>
+      </w:pPr>
+      <w:r>
+        <w:rPr>
+          <w:rFonts w:ascii="Verdana" w:hAnsi="Verdana"/>
+          <w:color w:val="FFFFFF" w:themeColor="background1"/>
+        </w:rPr>
+        <w:t xml:space="preserve">A létrehozás/csatlakozás után a játékos egy váróképernyővel találja szembe magát, amelyről a </w:t>
+      </w:r>
+      <w:r>
+        <w:rPr>
+          <w:rFonts w:ascii="Verdana" w:hAnsi="Verdana"/>
+          <w:i/>
+          <w:iCs/>
+          <w:color w:val="FFFFFF" w:themeColor="background1"/>
+        </w:rPr>
+        <w:t>host</w:t>
+      </w:r>
+      <w:r>
+        <w:rPr>
+          <w:rFonts w:ascii="Verdana" w:hAnsi="Verdana"/>
+          <w:color w:val="FFFFFF" w:themeColor="background1"/>
+        </w:rPr>
+        <w:t xml:space="preserve"> tud továbblépni (ekkor az összes többi várakozó játékos is továbblép). Ezután elkezdődik a játék a „Core gameplay” szekcióban leírt módon</w:t>
+      </w:r>
+      <w:r>
+        <w:rPr>
+          <w:rFonts w:ascii="Verdana" w:hAnsi="Verdana"/>
+          <w:color w:val="FFFFFF" w:themeColor="background1"/>
+        </w:rPr>
         <w:t>.</w:t>
       </w:r>
     </w:p>
     <w:p>
-      <w:r>
-        <w:t>A többjátékos játék megvalósításához a Unity Netcode rendszert használjuk.</w:t>
-      </w:r>
-    </w:p>
-    <w:p>
-      <w:pPr>
-        <w:rPr>
-          <w:sz w:val="28"/>
-          <w:szCs w:val="28"/>
-        </w:rPr>
-      </w:pPr>
-      <w:r>
-        <w:rPr>
-          <w:sz w:val="28"/>
-          <w:szCs w:val="28"/>
-        </w:rPr>
+      <w:pPr>
+        <w:jc w:val="both"/>
+        <w:rPr>
+          <w:rFonts w:ascii="Verdana" w:hAnsi="Verdana"/>
+          <w:color w:val="FFFFFF" w:themeColor="background1"/>
+        </w:rPr>
+      </w:pPr>
+      <w:r>
+        <w:rPr>
+          <w:rFonts w:ascii="Verdana" w:hAnsi="Verdana"/>
+          <w:color w:val="FFFFFF" w:themeColor="background1"/>
+        </w:rPr>
+        <w:t xml:space="preserve">A többjátékos játék megvalósításához a </w:t>
+      </w:r>
+      <w:r>
+        <w:rPr>
+          <w:rFonts w:ascii="Verdana" w:hAnsi="Verdana"/>
+          <w:b/>
+          <w:bCs/>
+          <w:color w:val="FFFFFF" w:themeColor="background1"/>
+        </w:rPr>
+        <w:t>Unity Netcode</w:t>
+      </w:r>
+      <w:r>
+        <w:rPr>
+          <w:rFonts w:ascii="Verdana" w:hAnsi="Verdana"/>
+          <w:color w:val="FFFFFF" w:themeColor="background1"/>
+        </w:rPr>
+        <w:t xml:space="preserve"> rendszert használjuk.</w:t>
+      </w:r>
+    </w:p>
+    <w:p>
+      <w:pPr>
+        <w:spacing w:before="360" w:after="240"/>
+        <w:rPr>
+          <w:rFonts w:ascii="Verdana" w:hAnsi="Verdana"/>
+          <w:b/>
+          <w:bCs/>
+          <w:color w:val="FFD100"/>
+          <w:sz w:val="32"/>
+          <w:szCs w:val="32"/>
+        </w:rPr>
+      </w:pPr>
+      <w:r>
+        <w:rPr>
+          <w:rFonts w:ascii="Verdana" w:hAnsi="Verdana"/>
+          <w:b/>
+          <w:bCs/>
+          <w:color w:val="FFD100"/>
+          <w:sz w:val="32"/>
+          <w:szCs w:val="32"/>
+        </w:rPr>
+        <w:lastRenderedPageBreak/>
         <w:t>Gépi ellenfelek</w:t>
       </w:r>
     </w:p>
     <w:p>
-      <w:r>
+      <w:pPr>
+        <w:jc w:val="both"/>
+        <w:rPr>
+          <w:rFonts w:ascii="Verdana" w:hAnsi="Verdana"/>
+          <w:color w:val="FFFFFF" w:themeColor="background1"/>
+        </w:rPr>
+      </w:pPr>
+      <w:r>
+        <w:rPr>
+          <w:rFonts w:ascii="Verdana" w:hAnsi="Verdana"/>
+          <w:color w:val="FFFFFF" w:themeColor="background1"/>
+        </w:rPr>
         <w:t>Az egyjátékos módban az ellenfeleket egy gépi tanulással betanított modell irányítja, mely a következő adatokkal dolgozik:</w:t>
       </w:r>
     </w:p>
@@ -410,8 +1138,17 @@
           <w:ilvl w:val="0"/>
           <w:numId w:val="6"/>
         </w:numPr>
-      </w:pPr>
-      <w:r>
+        <w:jc w:val="both"/>
+        <w:rPr>
+          <w:rFonts w:ascii="Verdana" w:hAnsi="Verdana"/>
+          <w:color w:val="FFFFFF" w:themeColor="background1"/>
+        </w:rPr>
+      </w:pPr>
+      <w:r>
+        <w:rPr>
+          <w:rFonts w:ascii="Verdana" w:hAnsi="Verdana"/>
+          <w:color w:val="FFFFFF" w:themeColor="background1"/>
+        </w:rPr>
         <w:t>Autó sebessége</w:t>
       </w:r>
     </w:p>
@@ -422,8 +1159,17 @@
           <w:ilvl w:val="0"/>
           <w:numId w:val="6"/>
         </w:numPr>
-      </w:pPr>
-      <w:r>
+        <w:jc w:val="both"/>
+        <w:rPr>
+          <w:rFonts w:ascii="Verdana" w:hAnsi="Verdana"/>
+          <w:color w:val="FFFFFF" w:themeColor="background1"/>
+        </w:rPr>
+      </w:pPr>
+      <w:r>
+        <w:rPr>
+          <w:rFonts w:ascii="Verdana" w:hAnsi="Verdana"/>
+          <w:color w:val="FFFFFF" w:themeColor="background1"/>
+        </w:rPr>
         <w:t>Autó térbeli orientációja</w:t>
       </w:r>
     </w:p>
@@ -434,8 +1180,17 @@
           <w:ilvl w:val="0"/>
           <w:numId w:val="6"/>
         </w:numPr>
-      </w:pPr>
-      <w:r>
+        <w:jc w:val="both"/>
+        <w:rPr>
+          <w:rFonts w:ascii="Verdana" w:hAnsi="Verdana"/>
+          <w:color w:val="FFFFFF" w:themeColor="background1"/>
+        </w:rPr>
+      </w:pPr>
+      <w:r>
+        <w:rPr>
+          <w:rFonts w:ascii="Verdana" w:hAnsi="Verdana"/>
+          <w:color w:val="FFFFFF" w:themeColor="background1"/>
+        </w:rPr>
         <w:t>Falak távolsága</w:t>
       </w:r>
     </w:p>
@@ -446,40 +1201,189 @@
           <w:ilvl w:val="0"/>
           <w:numId w:val="6"/>
         </w:numPr>
-      </w:pPr>
-      <w:r>
+        <w:jc w:val="both"/>
+        <w:rPr>
+          <w:rFonts w:ascii="Verdana" w:hAnsi="Verdana"/>
+          <w:color w:val="FFFFFF" w:themeColor="background1"/>
+        </w:rPr>
+      </w:pPr>
+      <w:r>
+        <w:rPr>
+          <w:rFonts w:ascii="Verdana" w:hAnsi="Verdana"/>
+          <w:color w:val="FFFFFF" w:themeColor="background1"/>
+        </w:rPr>
         <w:t>Következő kanyar jellemzői</w:t>
       </w:r>
     </w:p>
     <w:p>
-      <w:r>
+      <w:pPr>
+        <w:jc w:val="both"/>
+        <w:rPr>
+          <w:rFonts w:ascii="Verdana" w:hAnsi="Verdana"/>
+          <w:color w:val="FFFFFF" w:themeColor="background1"/>
+        </w:rPr>
+      </w:pPr>
+      <w:r>
+        <w:rPr>
+          <w:rFonts w:ascii="Verdana" w:hAnsi="Verdana"/>
+          <w:color w:val="FFFFFF" w:themeColor="background1"/>
+        </w:rPr>
         <w:t>A modellek megerősítéses tanulással lesznek betanítva, amelyhez a Unity MLAgents nevű könyvtár lesz használva.</w:t>
       </w:r>
     </w:p>
     <w:p>
-      <w:r>
+      <w:pPr>
+        <w:jc w:val="both"/>
+        <w:rPr>
+          <w:rFonts w:ascii="Verdana" w:hAnsi="Verdana"/>
+          <w:color w:val="FFFFFF" w:themeColor="background1"/>
+        </w:rPr>
+      </w:pPr>
+      <w:r>
+        <w:rPr>
+          <w:rFonts w:ascii="Verdana" w:hAnsi="Verdana"/>
+          <w:color w:val="FFFFFF" w:themeColor="background1"/>
+        </w:rPr>
         <w:t>A játékosnak lehetősége lesz különböző jellemzőkkel rendelkező modellek kiválasztására.</w:t>
       </w:r>
     </w:p>
     <w:p>
       <w:pPr>
-        <w:rPr>
-          <w:sz w:val="28"/>
-          <w:szCs w:val="28"/>
-        </w:rPr>
-      </w:pPr>
-      <w:r>
-        <w:rPr>
-          <w:sz w:val="28"/>
-          <w:szCs w:val="28"/>
-        </w:rPr>
-        <w:lastRenderedPageBreak/>
+        <w:spacing w:before="360" w:after="240"/>
+        <w:rPr>
+          <w:rFonts w:ascii="Verdana" w:hAnsi="Verdana"/>
+          <w:b/>
+          <w:bCs/>
+          <w:color w:val="FFD100"/>
+          <w:sz w:val="32"/>
+          <w:szCs w:val="32"/>
+        </w:rPr>
+      </w:pPr>
+      <w:r>
+        <w:rPr>
+          <w:rFonts w:ascii="Verdana" w:hAnsi="Verdana"/>
+          <w:b/>
+          <w:bCs/>
+          <w:color w:val="FFD100"/>
+          <w:sz w:val="32"/>
+          <w:szCs w:val="32"/>
+        </w:rPr>
         <w:t>A játék stílusa</w:t>
       </w:r>
     </w:p>
     <w:p>
-      <w:r>
-        <w:t>A játéknak egy neon/vaporwave stílusú megjelenése lesz, melynek az élénk és dinamikus kinézete mellett a kisebb videókártya-terhelés (nincs szükség megvilágítás számításra) az előnye.</w:t>
+      <w:pPr>
+        <w:jc w:val="both"/>
+        <w:rPr>
+          <w:rFonts w:ascii="Verdana" w:hAnsi="Verdana"/>
+          <w:color w:val="FFFFFF" w:themeColor="background1"/>
+        </w:rPr>
+      </w:pPr>
+      <w:r>
+        <w:rPr>
+          <w:rFonts w:ascii="Verdana" w:hAnsi="Verdana"/>
+          <w:color w:val="FFFFFF" w:themeColor="background1"/>
+        </w:rPr>
+        <w:t xml:space="preserve">A játéknak egy </w:t>
+      </w:r>
+      <w:r>
+        <w:rPr>
+          <w:rFonts w:ascii="Verdana" w:hAnsi="Verdana"/>
+          <w:color w:val="FFFFFF" w:themeColor="background1"/>
+        </w:rPr>
+        <w:t xml:space="preserve">low-poly, </w:t>
+      </w:r>
+      <w:r>
+        <w:rPr>
+          <w:rFonts w:ascii="Verdana" w:hAnsi="Verdana"/>
+          <w:color w:val="FFFFFF" w:themeColor="background1"/>
+        </w:rPr>
+        <w:t xml:space="preserve">neon/vaporwave stílusú megjelenése lesz, melynek az élénk és dinamikus </w:t>
+      </w:r>
+      <w:r>
+        <w:rPr>
+          <w:rFonts w:ascii="Verdana" w:hAnsi="Verdana"/>
+          <w:color w:val="FFFFFF" w:themeColor="background1"/>
+        </w:rPr>
+        <w:t>látványvilága</w:t>
+      </w:r>
+      <w:r>
+        <w:rPr>
+          <w:rFonts w:ascii="Verdana" w:hAnsi="Verdana"/>
+          <w:color w:val="FFFFFF" w:themeColor="background1"/>
+        </w:rPr>
+        <w:t xml:space="preserve"> mellett a kisebb videókártya-terhelés (nincs szükség megvilágítás számításra) az előnye.</w:t>
+      </w:r>
+    </w:p>
+    <w:p>
+      <w:pPr>
+        <w:jc w:val="both"/>
+        <w:rPr>
+          <w:rFonts w:ascii="Verdana" w:hAnsi="Verdana"/>
+          <w:color w:val="FFFFFF" w:themeColor="background1"/>
+        </w:rPr>
+      </w:pPr>
+      <w:r>
+        <w:rPr>
+          <w:rFonts w:ascii="Verdana" w:hAnsi="Verdana"/>
+          <w:color w:val="FFFFFF" w:themeColor="background1"/>
+        </w:rPr>
+        <w:t>A játék hasonlóan fog kinézni:</w:t>
+      </w:r>
+    </w:p>
+    <w:p>
+      <w:pPr>
+        <w:jc w:val="center"/>
+        <w:rPr>
+          <w:rFonts w:ascii="Verdana" w:hAnsi="Verdana"/>
+          <w:color w:val="FFFFFF" w:themeColor="background1"/>
+        </w:rPr>
+      </w:pPr>
+      <w:r>
+        <w:rPr>
+          <w:noProof/>
+        </w:rPr>
+        <w:drawing>
+          <wp:inline distT="0" distB="0" distL="0" distR="0" wp14:anchorId="4242C50C" wp14:editId="74C8FE83">
+            <wp:extent cx="5760720" cy="3115945"/>
+            <wp:effectExtent l="0" t="0" r="0" b="8255"/>
+            <wp:docPr id="823496447" name="Kép 1"/>
+            <wp:cNvGraphicFramePr>
+              <a:graphicFrameLocks xmlns:a="http://schemas.openxmlformats.org/drawingml/2006/main" noChangeAspect="1"/>
+            </wp:cNvGraphicFramePr>
+            <a:graphic xmlns:a="http://schemas.openxmlformats.org/drawingml/2006/main">
+              <a:graphicData uri="http://schemas.openxmlformats.org/drawingml/2006/picture">
+                <pic:pic xmlns:pic="http://schemas.openxmlformats.org/drawingml/2006/picture">
+                  <pic:nvPicPr>
+                    <pic:cNvPr id="823496447" name=""/>
+                    <pic:cNvPicPr/>
+                  </pic:nvPicPr>
+                  <pic:blipFill>
+                    <a:blip r:embed="rId5" cstate="print">
+                      <a:extLst>
+                        <a:ext uri="{28A0092B-C50C-407E-A947-70E740481C1C}">
+                          <a14:useLocalDpi xmlns:a14="http://schemas.microsoft.com/office/drawing/2010/main" val="0"/>
+                        </a:ext>
+                      </a:extLst>
+                    </a:blip>
+                    <a:stretch>
+                      <a:fillRect/>
+                    </a:stretch>
+                  </pic:blipFill>
+                  <pic:spPr>
+                    <a:xfrm>
+                      <a:off x="0" y="0"/>
+                      <a:ext cx="5760720" cy="3115945"/>
+                    </a:xfrm>
+                    <a:prstGeom prst="rect">
+                      <a:avLst/>
+                    </a:prstGeom>
+                  </pic:spPr>
+                </pic:pic>
+              </a:graphicData>
+            </a:graphic>
+          </wp:inline>
+        </w:drawing>
       </w:r>
     </w:p>
     <w:sectPr>

</xml_diff>